<commit_message>
Remove under-review preprint from CV; keep only accepted/published papers
Co-Authored-By: Claude Sonnet 5 <noreply@anthropic.com>
</commit_message>
<xml_diff>
--- a/uptodate-cv.docx
+++ b/uptodate-cv.docx
@@ -675,21 +675,6 @@
         <w:ind w:left="0"/>
       </w:pPr>
       <w:r>
-        <w:t xml:space="preserve">Kialy, Uri Z., Avi Shtarkberg, and Ayal Klein. </w:t>
-      </w:r>
-      <w:r>
-        <w:t xml:space="preserve">"A Universal Vibe? Finding and Controlling Language-Agnostic Informal Register with SAEs." </w:t>
-      </w:r>
-      <w:r>
-        <w:t>arXiv preprint arXiv:2603.26236. Under review. 2026.</w:t>
-      </w:r>
-    </w:p>
-    <w:p>
-      <w:pPr>
-        <w:spacing w:after="200"/>
-        <w:ind w:left="0"/>
-      </w:pPr>
-      <w:r>
         <w:t xml:space="preserve">Ali, Iqra, Talia Tseriotou, Guy Dvir, Callum Chan, Yuxiang Zhou, Juan Antonio Lossio-Ventura, Ayal Klein, et al. </w:t>
       </w:r>
       <w:r>

</xml_diff>

<commit_message>
Number CV publications, oldest as 1 through newest
Co-Authored-By: Claude Sonnet 5 <noreply@anthropic.com>
</commit_message>
<xml_diff>
--- a/uptodate-cv.docx
+++ b/uptodate-cv.docx
@@ -642,8 +642,14 @@
     <w:p>
       <w:pPr>
         <w:spacing w:after="200"/>
-        <w:ind w:left="0"/>
+        <w:ind w:left="360" w:hanging="360"/>
       </w:pPr>
+      <w:r>
+        <w:rPr>
+          <w:b/>
+        </w:rPr>
+        <w:t xml:space="preserve">17. </w:t>
+      </w:r>
       <w:r>
         <w:t xml:space="preserve">Bar-Shachar, Yael, Dana Rafael, Anmol Goel, Ayal Klein, Iryna Gurevych, and Dana Atzil-Slonim. </w:t>
       </w:r>
@@ -657,8 +663,14 @@
     <w:p>
       <w:pPr>
         <w:spacing w:after="200"/>
-        <w:ind w:left="0"/>
+        <w:ind w:left="360" w:hanging="360"/>
       </w:pPr>
+      <w:r>
+        <w:rPr>
+          <w:b/>
+        </w:rPr>
+        <w:t xml:space="preserve">16. </w:t>
+      </w:r>
       <w:r>
         <w:t xml:space="preserve">Keren, Liran, Yael Bar-Shachar, Ayal Klein, Maria Liakata, and Dana Atzil-Slonim. </w:t>
       </w:r>
@@ -672,8 +684,14 @@
     <w:p>
       <w:pPr>
         <w:spacing w:after="200"/>
-        <w:ind w:left="0"/>
+        <w:ind w:left="360" w:hanging="360"/>
       </w:pPr>
+      <w:r>
+        <w:rPr>
+          <w:b/>
+        </w:rPr>
+        <w:t xml:space="preserve">15. </w:t>
+      </w:r>
       <w:r>
         <w:t xml:space="preserve">Ali, Iqra, Talia Tseriotou, Guy Dvir, Callum Chan, Yuxiang Zhou, Juan Antonio Lossio-Ventura, Ayal Klein, et al. </w:t>
       </w:r>
@@ -687,8 +705,14 @@
     <w:p>
       <w:pPr>
         <w:spacing w:after="200"/>
-        <w:ind w:left="0"/>
+        <w:ind w:left="360" w:hanging="360"/>
       </w:pPr>
+      <w:r>
+        <w:rPr>
+          <w:b/>
+        </w:rPr>
+        <w:t xml:space="preserve">14. </w:t>
+      </w:r>
       <w:r>
         <w:t xml:space="preserve">Davidov, Jonathan, Aviv Slobodkin, Shmuel Tomi Klein, Reut Tsarfaty, Ido Dagan, and Ayal Klein. </w:t>
       </w:r>
@@ -702,8 +726,14 @@
     <w:p>
       <w:pPr>
         <w:spacing w:after="200"/>
-        <w:ind w:left="0"/>
+        <w:ind w:left="360" w:hanging="360"/>
       </w:pPr>
+      <w:r>
+        <w:rPr>
+          <w:b/>
+        </w:rPr>
+        <w:t xml:space="preserve">13. </w:t>
+      </w:r>
       <w:r>
         <w:t xml:space="preserve">Klein, Ayal, Jiayu Song, Jenny Chim, Liran Keren, Andreas Triantafyllopoulos, Björn W. Schuller, Maria Liakata, and Dana Atzil-Slonim. </w:t>
       </w:r>
@@ -717,8 +747,14 @@
     <w:p>
       <w:pPr>
         <w:spacing w:after="200"/>
-        <w:ind w:left="0"/>
+        <w:ind w:left="360" w:hanging="360"/>
       </w:pPr>
+      <w:r>
+        <w:rPr>
+          <w:b/>
+        </w:rPr>
+        <w:t xml:space="preserve">12. </w:t>
+      </w:r>
       <w:r>
         <w:t xml:space="preserve">Tseytlin, Maria, Paul Roit, Omri Abend, Ido Dagan, and Ayal Klein. </w:t>
       </w:r>
@@ -732,8 +768,14 @@
     <w:p>
       <w:pPr>
         <w:spacing w:after="200"/>
-        <w:ind w:left="0"/>
+        <w:ind w:left="360" w:hanging="360"/>
       </w:pPr>
+      <w:r>
+        <w:rPr>
+          <w:b/>
+        </w:rPr>
+        <w:t xml:space="preserve">11. </w:t>
+      </w:r>
       <w:r>
         <w:t xml:space="preserve">Tseriotou, Talia, Jenny Chim, Ayal Klein, Aya Shamir, Guy Dvir, Iqra Ali, Cian Kennedy, Guneet Singh Kohli, Anthony Hills, Ayah Zirikly, Dana Atzil-Slonim, and Maria Liakata. </w:t>
       </w:r>
@@ -747,8 +789,14 @@
     <w:p>
       <w:pPr>
         <w:spacing w:after="200"/>
-        <w:ind w:left="0"/>
+        <w:ind w:left="360" w:hanging="360"/>
       </w:pPr>
+      <w:r>
+        <w:rPr>
+          <w:b/>
+        </w:rPr>
+        <w:t xml:space="preserve">10. </w:t>
+      </w:r>
       <w:r>
         <w:t xml:space="preserve">Zhang, Shiyue, David Wan, Arie Cattan, Ayal Klein, Ido Dagan, and Mohit Bansal. </w:t>
       </w:r>
@@ -762,8 +810,14 @@
     <w:p>
       <w:pPr>
         <w:spacing w:after="200"/>
-        <w:ind w:left="0"/>
+        <w:ind w:left="360" w:hanging="360"/>
       </w:pPr>
+      <w:r>
+        <w:rPr>
+          <w:b/>
+        </w:rPr>
+        <w:t xml:space="preserve">9. </w:t>
+      </w:r>
       <w:r>
         <w:t xml:space="preserve">Triantafyllopoulos, Andreas, Yannik Terhorst, Iosif Tsangko, Florian B. Pokorny, Ayal Klein, et al. </w:t>
       </w:r>
@@ -777,8 +831,14 @@
     <w:p>
       <w:pPr>
         <w:spacing w:after="200"/>
-        <w:ind w:left="0"/>
+        <w:ind w:left="360" w:hanging="360"/>
       </w:pPr>
+      <w:r>
+        <w:rPr>
+          <w:b/>
+        </w:rPr>
+        <w:t xml:space="preserve">8. </w:t>
+      </w:r>
       <w:r>
         <w:t xml:space="preserve">Roit, Paul, Aviv Slobodkin, Eran Hirsch, Arie Cattan, Ayal Klein, Valentina Pyatkin, and Ido Dagan. </w:t>
       </w:r>
@@ -792,8 +852,14 @@
     <w:p>
       <w:pPr>
         <w:spacing w:after="200"/>
-        <w:ind w:left="0"/>
+        <w:ind w:left="360" w:hanging="360"/>
       </w:pPr>
+      <w:r>
+        <w:rPr>
+          <w:b/>
+        </w:rPr>
+        <w:t xml:space="preserve">7. </w:t>
+      </w:r>
       <w:r>
         <w:t xml:space="preserve">Pesahov, Leon, Ayal Klein, and Ido Dagan. </w:t>
       </w:r>
@@ -807,8 +873,14 @@
     <w:p>
       <w:pPr>
         <w:spacing w:after="200"/>
-        <w:ind w:left="0"/>
+        <w:ind w:left="360" w:hanging="360"/>
       </w:pPr>
+      <w:r>
+        <w:rPr>
+          <w:b/>
+        </w:rPr>
+        <w:t xml:space="preserve">6. </w:t>
+      </w:r>
       <w:r>
         <w:t xml:space="preserve">Klein, Ayal, Eran Hirsch, Ron Eliav, Valentina Pyatkin, Avi Caciularu, and Ido Dagan. </w:t>
       </w:r>
@@ -822,8 +894,14 @@
     <w:p>
       <w:pPr>
         <w:spacing w:after="200"/>
-        <w:ind w:left="0"/>
+        <w:ind w:left="360" w:hanging="360"/>
       </w:pPr>
+      <w:r>
+        <w:rPr>
+          <w:b/>
+        </w:rPr>
+        <w:t xml:space="preserve">5. </w:t>
+      </w:r>
       <w:r>
         <w:t xml:space="preserve">Klein, Ayal, Oren Pereg, Daniel Korat, Vasudev Lal, Moshe Wasserblat, and Ido Dagan. </w:t>
       </w:r>
@@ -837,8 +915,14 @@
     <w:p>
       <w:pPr>
         <w:spacing w:after="200"/>
-        <w:ind w:left="0"/>
+        <w:ind w:left="360" w:hanging="360"/>
       </w:pPr>
+      <w:r>
+        <w:rPr>
+          <w:b/>
+        </w:rPr>
+        <w:t xml:space="preserve">4. </w:t>
+      </w:r>
       <w:r>
         <w:t xml:space="preserve">Weiss, Daniela Brook, Paul Roit, Ayal Klein, Ori Ernst, and Ido Dagan. </w:t>
       </w:r>
@@ -852,8 +936,14 @@
     <w:p>
       <w:pPr>
         <w:spacing w:after="200"/>
-        <w:ind w:left="0"/>
+        <w:ind w:left="360" w:hanging="360"/>
       </w:pPr>
+      <w:r>
+        <w:rPr>
+          <w:b/>
+        </w:rPr>
+        <w:t xml:space="preserve">3. </w:t>
+      </w:r>
       <w:r>
         <w:t xml:space="preserve">Klein, Ayal, Jonathan Mamou, Valentina Pyatkin, Daniela Stepanov, Hangfeng He, Dan Roth, Luke Zettlemoyer, and Ido Dagan. </w:t>
       </w:r>
@@ -867,8 +957,14 @@
     <w:p>
       <w:pPr>
         <w:spacing w:after="200"/>
-        <w:ind w:left="0"/>
+        <w:ind w:left="360" w:hanging="360"/>
       </w:pPr>
+      <w:r>
+        <w:rPr>
+          <w:b/>
+        </w:rPr>
+        <w:t xml:space="preserve">2. </w:t>
+      </w:r>
       <w:r>
         <w:t xml:space="preserve">Roit, Paul, Ayal Klein, Daniela Stepanov, Jonathan Mamou, Julian Michael, Gabriel Stanovsky, Luke Zettlemoyer, and Ido Dagan. </w:t>
       </w:r>
@@ -882,8 +978,14 @@
     <w:p>
       <w:pPr>
         <w:spacing w:after="200"/>
-        <w:ind w:left="0"/>
+        <w:ind w:left="360" w:hanging="360"/>
       </w:pPr>
+      <w:r>
+        <w:rPr>
+          <w:b/>
+        </w:rPr>
+        <w:t xml:space="preserve">1. </w:t>
+      </w:r>
       <w:r>
         <w:t xml:space="preserve">Pyatkin, Valentina, Ayal Klein, Reut Tsarfaty, and Ido Dagan. </w:t>
       </w:r>

</xml_diff>

<commit_message>
Update SAE/register paper to EMNLP 2026 acceptance; add lab news
Co-Authored-By: Claude Sonnet 5 <noreply@anthropic.com>
</commit_message>
<xml_diff>
--- a/uptodate-cv.docx
+++ b/uptodate-cv.docx
@@ -648,6 +648,27 @@
         <w:rPr>
           <w:b/>
         </w:rPr>
+        <w:t xml:space="preserve">18. </w:t>
+      </w:r>
+      <w:r>
+        <w:t xml:space="preserve">Kialy, Uri Z., Avi Shtarkberg, and Ayal Klein. </w:t>
+      </w:r>
+      <w:r>
+        <w:t xml:space="preserve">"A Universal Vibe? Finding and Controlling Language-Agnostic Informal Register with SAEs." </w:t>
+      </w:r>
+      <w:r>
+        <w:t>Proceedings of EMNLP 2026 (Main Conference). Association for Computational Linguistics. 2026.</w:t>
+      </w:r>
+    </w:p>
+    <w:p>
+      <w:pPr>
+        <w:spacing w:after="200"/>
+        <w:ind w:left="360" w:hanging="360"/>
+      </w:pPr>
+      <w:r>
+        <w:rPr>
+          <w:b/>
+        </w:rPr>
         <w:t xml:space="preserve">17. </w:t>
       </w:r>
       <w:r>

</xml_diff>